<commit_message>
Fixed locks on some puzzles + Added story to puzzles
Needed to remove override on PuzzleSolved on a couple puzzles. Seems to work, just moved AttemptCouter() and IsSolved to where puzzle gets solved next to PuzzleSolved method.
</commit_message>
<xml_diff>
--- a/Script And Map/Shattered Protocols Script.docx
+++ b/Script And Map/Shattered Protocols Script.docx
@@ -234,10 +234,7 @@
         <w:ind w:left="-4"/>
       </w:pPr>
       <w:r>
-        <w:t>The lock heading to the Testing Room requires a profile with Admin rights</w:t>
-      </w:r>
-      <w:r>
-        <w:t xml:space="preserve"> to get through.</w:t>
+        <w:t>The lock heading to the Testing Room requires a profile with Admin rights to get through.</w:t>
       </w:r>
       <w:r>
         <w:t xml:space="preserve"> </w:t>
@@ -295,15 +292,22 @@
           <w:b/>
           <w:bCs/>
         </w:rPr>
-        <w:t>Password Cracker Puzzle</w:t>
-      </w:r>
-    </w:p>
-    <w:p>
-      <w:pPr>
-        <w:ind w:left="-4"/>
-      </w:pPr>
-      <w:r>
-        <w:t xml:space="preserve">Welcome to the Development Labs. Here, there are computers scattered across desks. The layers of dust are only matched by the layers of Cheeto powder across the keyboards. This room was used to make many general-purpose AI for the task of gathering information, and generating advice based on the data. </w:t>
+        <w:t>Port Scan</w:t>
+      </w:r>
+      <w:r>
+        <w:rPr>
+          <w:b/>
+          <w:bCs/>
+        </w:rPr>
+        <w:t xml:space="preserve"> Puzzle</w:t>
+      </w:r>
+    </w:p>
+    <w:p>
+      <w:pPr>
+        <w:ind w:left="-4"/>
+      </w:pPr>
+      <w:r>
+        <w:t>Welcome to the Development Labs. Here, there are computers scattered across desks. The layers of dust are only matched by the layers of Cheeto powder across the keyboards. This room was used to make many general-purpose AI for the task of gathering information, and generating advice based on the data.</w:t>
       </w:r>
     </w:p>
     <w:p>
@@ -319,7 +323,47 @@
         <w:ind w:left="-4"/>
       </w:pPr>
       <w:r>
-        <w:t>There is a door terminal keeping access to the Break Room that says, “In pursuit of deterring the constant snack breaks, we put a simple lock here.” Unfortunately, the password is a hash, so this simple password might be a bit more complicated.</w:t>
+        <w:t xml:space="preserve">There is a door terminal keeping access to the Break Room that says, “In pursuit of deterring the constant snack breaks, we put a simple lock here.” Unfortunately, the </w:t>
+      </w:r>
+      <w:r>
+        <w:t>“</w:t>
+      </w:r>
+      <w:r>
+        <w:t>password</w:t>
+      </w:r>
+      <w:r>
+        <w:t>”</w:t>
+      </w:r>
+      <w:r>
+        <w:t xml:space="preserve"> </w:t>
+      </w:r>
+      <w:r>
+        <w:t xml:space="preserve">is </w:t>
+      </w:r>
+      <w:proofErr w:type="gramStart"/>
+      <w:r>
+        <w:t>actually a</w:t>
+      </w:r>
+      <w:proofErr w:type="gramEnd"/>
+      <w:r>
+        <w:t xml:space="preserve"> port scan</w:t>
+      </w:r>
+      <w:r>
+        <w:t>, so this simple password might be a bit more complicated.</w:t>
+      </w:r>
+      <w:r>
+        <w:t xml:space="preserve"> </w:t>
+      </w:r>
+      <w:r>
+        <w:t>Seems you have to “identify” if the port to the breakroom is “</w:t>
+      </w:r>
+      <w:proofErr w:type="gramStart"/>
+      <w:r>
+        <w:t>open”…</w:t>
+      </w:r>
+      <w:proofErr w:type="gramEnd"/>
+      <w:r>
+        <w:t xml:space="preserve"> what a bunch of nerds…</w:t>
       </w:r>
     </w:p>
     <w:p>
@@ -335,7 +379,49 @@
         <w:ind w:left="-4"/>
       </w:pPr>
       <w:r>
-        <w:t>This hash was no match for the skills of the top computer scientist in the Rebel Allianc</w:t>
+        <w:t>PORT     STATE    SERVICE</w:t>
+      </w:r>
+    </w:p>
+    <w:p>
+      <w:pPr>
+        <w:ind w:left="-4"/>
+      </w:pPr>
+      <w:r>
+        <w:t>2</w:t>
+      </w:r>
+      <w:r>
+        <w:t>1</w:t>
+      </w:r>
+      <w:r>
+        <w:t>/</w:t>
+      </w:r>
+      <w:proofErr w:type="spellStart"/>
+      <w:r>
+        <w:t>tcp</w:t>
+      </w:r>
+      <w:proofErr w:type="spellEnd"/>
+      <w:r>
+        <w:t xml:space="preserve">   open     </w:t>
+      </w:r>
+      <w:r>
+        <w:t>FTP (File Transfer Protocol is ready for user to be uploaded into Break Room)</w:t>
+      </w:r>
+    </w:p>
+    <w:p>
+      <w:pPr>
+        <w:ind w:left="-4"/>
+      </w:pPr>
+      <w:r>
+        <w:t>Wow… too much thought was put into this lock. Anyway, t</w:t>
+      </w:r>
+      <w:r>
+        <w:t xml:space="preserve">his </w:t>
+      </w:r>
+      <w:r>
+        <w:t>port scan</w:t>
+      </w:r>
+      <w:r>
+        <w:t xml:space="preserve"> was no match for the skills of the top computer scientist in the Rebel Allianc</w:t>
       </w:r>
       <w:r>
         <w:t>e. Time to take a break in the break room!</w:t>
@@ -383,42 +469,63 @@
       </w:r>
       <w:proofErr w:type="spellEnd"/>
       <w:r>
-        <w:t xml:space="preserve"> would still survive. That’s why you are here. There seems to be a slot in the casing. </w:t>
-      </w:r>
-    </w:p>
-    <w:p>
-      <w:pPr>
-        <w:ind w:left="-4"/>
-      </w:pPr>
-      <w:r>
-        <w:t>Before Puzzle, but after inserting key (or just having the key on hand):</w:t>
-      </w:r>
-    </w:p>
-    <w:p>
-      <w:pPr>
-        <w:ind w:left="-4"/>
-      </w:pPr>
-      <w:r>
-        <w:t xml:space="preserve">Finally, after all these puzzles… it’s time to crack open this casing and end the tyranny of the machines. You insert the key into the slot and a </w:t>
-      </w:r>
-      <w:r>
-        <w:t>window</w:t>
-      </w:r>
-      <w:r>
-        <w:t xml:space="preserve"> pops up</w:t>
-      </w:r>
-      <w:r>
-        <w:t xml:space="preserve"> on the terminal</w:t>
-      </w:r>
-      <w:r>
-        <w:t xml:space="preserve"> asking for the password. You really don’t want to guess the password for hours, so it’s time to apply some hacks with your extensive knowledge in SQL. The inputs might not have been properly sanitized, might as well as try smarter and not harder at first…</w:t>
-      </w:r>
-    </w:p>
-    <w:p>
-      <w:pPr>
-        <w:ind w:left="-4"/>
-      </w:pPr>
-      <w:r>
+        <w:t xml:space="preserve"> would still survive. That's why you are here. There seems to be a USB port in the casing. Huh... there is also a suspicious looking avian symbol above the port...</w:t>
+      </w:r>
+    </w:p>
+    <w:p>
+      <w:pPr>
+        <w:ind w:left="-4"/>
+      </w:pPr>
+      <w:r>
+        <w:t xml:space="preserve">Before Puzzle, but after inserting </w:t>
+      </w:r>
+      <w:proofErr w:type="spellStart"/>
+      <w:r>
+        <w:t>ducky_flash_drive</w:t>
+      </w:r>
+      <w:proofErr w:type="spellEnd"/>
+      <w:r>
+        <w:t>:</w:t>
+      </w:r>
+    </w:p>
+    <w:p>
+      <w:pPr>
+        <w:ind w:left="-4"/>
+      </w:pPr>
+      <w:r>
+        <w:t xml:space="preserve">Finally, after all these puzzles… it's time to </w:t>
+      </w:r>
+      <w:r>
+        <w:t>quack</w:t>
+      </w:r>
+      <w:r>
+        <w:t xml:space="preserve"> open this casing and end the tyranny</w:t>
+      </w:r>
+      <w:r>
+        <w:t xml:space="preserve"> </w:t>
+      </w:r>
+      <w:r>
+        <w:t xml:space="preserve">of the machines. You insert the flash drive into the port... you hear a faint </w:t>
+      </w:r>
+      <w:r>
+        <w:t xml:space="preserve">duck noise, </w:t>
+      </w:r>
+      <w:r>
+        <w:t>and a window pops up on the terminal asking for the password. You really don't want to guess the password for hours, so it's time to apply some hacks with your extensive knowledge in SQL. The inputs might not have been properly sanitized, might as well as try smarter</w:t>
+      </w:r>
+      <w:r>
+        <w:t xml:space="preserve"> </w:t>
+      </w:r>
+      <w:r>
+        <w:t xml:space="preserve">and not harder at first… </w:t>
+      </w:r>
+    </w:p>
+    <w:p>
+      <w:pPr>
+        <w:ind w:left="-4"/>
+      </w:pPr>
+      <w:r>
+        <w:lastRenderedPageBreak/>
         <w:t>After Puzzle:</w:t>
       </w:r>
     </w:p>
@@ -449,7 +556,6 @@
           <w:b/>
           <w:bCs/>
         </w:rPr>
-        <w:lastRenderedPageBreak/>
         <w:t xml:space="preserve">R4: </w:t>
       </w:r>
       <w:r>
@@ -552,6 +658,11 @@
     </w:p>
     <w:p>
       <w:pPr>
+        <w:ind w:left="-4"/>
+      </w:pPr>
+    </w:p>
+    <w:p>
+      <w:pPr>
         <w:spacing w:line="259" w:lineRule="auto"/>
         <w:ind w:left="-4"/>
         <w:rPr>
@@ -571,18 +682,43 @@
           <w:b/>
           <w:bCs/>
         </w:rPr>
-        <w:t>No Puzzle, Obj Key</w:t>
-      </w:r>
-    </w:p>
-    <w:p>
-      <w:pPr>
-        <w:ind w:left="-4"/>
-      </w:pPr>
-      <w:r>
-        <w:t>Welcome to the Break Room. A freezer full of frozen burritos and a microwave stained with various food remains were previously used for refueling energy deprived programmers. A couple of lockers are broken open in the corner of the room.</w:t>
-      </w:r>
-      <w:r>
-        <w:t xml:space="preserve"> In one of the lockers is a key! This must be important…</w:t>
+        <w:t>Binary Search Puzzle</w:t>
+      </w:r>
+      <w:r>
+        <w:rPr>
+          <w:b/>
+          <w:bCs/>
+        </w:rPr>
+        <w:t xml:space="preserve">, Obj </w:t>
+      </w:r>
+      <w:proofErr w:type="spellStart"/>
+      <w:r>
+        <w:rPr>
+          <w:b/>
+          <w:bCs/>
+        </w:rPr>
+        <w:t>ducky_flash_drive</w:t>
+      </w:r>
+      <w:proofErr w:type="spellEnd"/>
+    </w:p>
+    <w:p>
+      <w:pPr>
+        <w:ind w:left="-4"/>
+      </w:pPr>
+      <w:r>
+        <w:t>Welcome to the Break Room. A freezer full of frozen burritos and a microwave</w:t>
+      </w:r>
+      <w:r>
+        <w:t xml:space="preserve"> </w:t>
+      </w:r>
+      <w:r>
+        <w:t>stained with various food remains were previously used for refueling energy deprived programmers. A couple of lockers are broken open in the corner of the room. In one of the lockers is a flash drive in the shape of a rubber</w:t>
+      </w:r>
+      <w:r>
+        <w:t xml:space="preserve"> </w:t>
+      </w:r>
+      <w:r>
+        <w:t>ducky! This must be important…</w:t>
       </w:r>
     </w:p>
     <w:p>
@@ -591,8 +727,69 @@
         <w:ind w:left="-4" w:right="2864"/>
       </w:pPr>
       <w:r>
-        <w:t xml:space="preserve">(Here we can have the key to be used for the Heart of Operations) </w:t>
-      </w:r>
+        <w:t>--</w:t>
+      </w:r>
+      <w:proofErr w:type="spellStart"/>
+      <w:r>
+        <w:t>ducky_flash_drive</w:t>
+      </w:r>
+      <w:proofErr w:type="spellEnd"/>
+      <w:r>
+        <w:t>-- for use in Heart of Operations (R3)</w:t>
+      </w:r>
+      <w:r>
+        <w:t xml:space="preserve"> </w:t>
+      </w:r>
+    </w:p>
+    <w:p>
+      <w:pPr>
+        <w:spacing w:after="0" w:line="404" w:lineRule="auto"/>
+        <w:ind w:left="-4" w:right="2864"/>
+      </w:pPr>
+      <w:r>
+        <w:t>Before Puzzle:</w:t>
+      </w:r>
+    </w:p>
+    <w:p>
+      <w:pPr>
+        <w:ind w:left="-4"/>
+      </w:pPr>
+      <w:r>
+        <w:t>The door across seems to be locked</w:t>
+      </w:r>
+      <w:r>
+        <w:t xml:space="preserve">. You thought it odd that exiting the breakroom would also have a lock. This place is just a puzzle bonanza! </w:t>
+      </w:r>
+      <w:r>
+        <w:t>Above the terminal it says, “Warm Back Up for Work!” A</w:t>
+      </w:r>
+      <w:r>
+        <w:t>nyway, the lock seems to want you to pinpoint a specific randomized IP address within a range. Since you have extensive knowledge of binary search application, this will be a cinch for you.</w:t>
+      </w:r>
+    </w:p>
+    <w:p>
+      <w:pPr>
+        <w:ind w:left="-4"/>
+      </w:pPr>
+      <w:r>
+        <w:t>After Puzzle:</w:t>
+      </w:r>
+    </w:p>
+    <w:p>
+      <w:pPr>
+        <w:ind w:left="-4"/>
+      </w:pPr>
+      <w:r>
+        <w:t xml:space="preserve">You pinpointed the IP address and punched it into the terminal. You hear a *click* and you can now freely leave the Break Room. You thought that getting locked into the break room was more of a fire hazard than a </w:t>
+      </w:r>
+      <w:r>
+        <w:t>fun way to warm back up to go to work. But oh well, on to the next puzzle!</w:t>
+      </w:r>
+    </w:p>
+    <w:p>
+      <w:pPr>
+        <w:ind w:left="-4"/>
+      </w:pPr>
     </w:p>
     <w:p>
       <w:pPr>
@@ -615,6 +812,7 @@
         <w:ind w:left="-4"/>
       </w:pPr>
       <w:r>
+        <w:lastRenderedPageBreak/>
         <w:t xml:space="preserve">Welcome to the Server Room. Many </w:t>
       </w:r>
       <w:proofErr w:type="gramStart"/>
@@ -1134,7 +1332,6 @@
   <w:style w:type="character" w:default="1" w:styleId="DefaultParagraphFont">
     <w:name w:val="Default Paragraph Font"/>
     <w:uiPriority w:val="1"/>
-    <w:semiHidden/>
     <w:unhideWhenUsed/>
   </w:style>
   <w:style w:type="table" w:default="1" w:styleId="TableNormal">

</xml_diff>